<commit_message>
Interface Word Datei Änderung
</commit_message>
<xml_diff>
--- a/CAD Interfave.docx
+++ b/CAD Interfave.docx
@@ -19,23 +19,7 @@
     </w:p>
     <w:p>
       <w:r>
-        <w:t>Bildschirm am Zelt (</w:t>
-      </w:r>
-      <w:proofErr w:type="spellStart"/>
-      <w:r>
-        <w:t>read</w:t>
-      </w:r>
-      <w:proofErr w:type="spellEnd"/>
-      <w:r>
-        <w:t xml:space="preserve"> </w:t>
-      </w:r>
-      <w:proofErr w:type="spellStart"/>
-      <w:r>
-        <w:t>only</w:t>
-      </w:r>
-      <w:proofErr w:type="spellEnd"/>
-      <w:r>
-        <w:t>):</w:t>
+        <w:t>Bildschirm am Zelt (read only):</w:t>
       </w:r>
     </w:p>
     <w:p>
@@ -168,22 +152,12 @@
           </mc:Fallback>
         </mc:AlternateContent>
       </w:r>
-      <w:proofErr w:type="spellStart"/>
-      <w:r>
-        <w:t>Farb</w:t>
-      </w:r>
-      <w:proofErr w:type="spellEnd"/>
-      <w:r>
-        <w:t>/Zeichenindikator, ob Werte in vorgesehenem Bereich sind</w:t>
-      </w:r>
-      <w:r>
-        <w:t xml:space="preserve"> oder </w:t>
-      </w:r>
-      <w:proofErr w:type="gramStart"/>
-      <w:r>
-        <w:t>LED Anzeige</w:t>
-      </w:r>
-      <w:proofErr w:type="gramEnd"/>
+      <w:r>
+        <w:t>Farb/Zeichenindikator, ob Werte in vorgesehenem Bereich sind</w:t>
+      </w:r>
+      <w:r>
+        <w:t xml:space="preserve"> oder LED Anzeige</w:t>
+      </w:r>
     </w:p>
     <w:p>
       <w:pPr>
@@ -483,14 +457,7 @@
                             </w:r>
                             <w:r>
                               <w:br/>
-                            </w:r>
-                            <w:proofErr w:type="spellStart"/>
-                            <w:r>
-                              <w:t>Temp</w:t>
-                            </w:r>
-                            <w:proofErr w:type="spellEnd"/>
-                            <w:r>
-                              <w:t>.: 34°C</w:t>
+                              <w:t>Temp.: 34°C</w:t>
                             </w:r>
                             <w:r>
                               <w:br/>
@@ -541,14 +508,7 @@
                       </w:r>
                       <w:r>
                         <w:br/>
-                      </w:r>
-                      <w:proofErr w:type="spellStart"/>
-                      <w:r>
-                        <w:t>Temp</w:t>
-                      </w:r>
-                      <w:proofErr w:type="spellEnd"/>
-                      <w:r>
-                        <w:t>.: 34°C</w:t>
+                        <w:t>Temp.: 34°C</w:t>
                       </w:r>
                       <w:r>
                         <w:br/>
@@ -798,15 +758,7 @@
     </w:p>
     <w:p>
       <w:r>
-        <w:t>Webinterface (</w:t>
-      </w:r>
-      <w:proofErr w:type="spellStart"/>
-      <w:r>
-        <w:t>r&amp;w</w:t>
-      </w:r>
-      <w:proofErr w:type="spellEnd"/>
-      <w:r>
-        <w:t>):</w:t>
+        <w:t>Webinterface (r&amp;w):</w:t>
       </w:r>
     </w:p>
     <w:p>
@@ -1299,7 +1251,6 @@
                                 <w:szCs w:val="22"/>
                               </w:rPr>
                             </w:pPr>
-                            <w:proofErr w:type="spellStart"/>
                             <w:r>
                               <w:rPr>
                                 <w:sz w:val="22"/>
@@ -1312,15 +1263,7 @@
                                 <w:sz w:val="22"/>
                                 <w:szCs w:val="22"/>
                               </w:rPr>
-                              <w:t>_Adresse</w:t>
-                            </w:r>
-                            <w:proofErr w:type="spellEnd"/>
-                            <w:r>
-                              <w:rPr>
-                                <w:sz w:val="22"/>
-                                <w:szCs w:val="22"/>
-                              </w:rPr>
-                              <w:t xml:space="preserve"> im Netzwerk</w:t>
+                              <w:t>_Adresse im Netzwerk</w:t>
                             </w:r>
                           </w:p>
                         </w:txbxContent>
@@ -1357,7 +1300,6 @@
                           <w:szCs w:val="22"/>
                         </w:rPr>
                       </w:pPr>
-                      <w:proofErr w:type="spellStart"/>
                       <w:r>
                         <w:rPr>
                           <w:sz w:val="22"/>
@@ -1370,15 +1312,7 @@
                           <w:sz w:val="22"/>
                           <w:szCs w:val="22"/>
                         </w:rPr>
-                        <w:t>_Adresse</w:t>
-                      </w:r>
-                      <w:proofErr w:type="spellEnd"/>
-                      <w:r>
-                        <w:rPr>
-                          <w:sz w:val="22"/>
-                          <w:szCs w:val="22"/>
-                        </w:rPr>
-                        <w:t xml:space="preserve"> im Netzwerk</w:t>
+                        <w:t>_Adresse im Netzwerk</w:t>
                       </w:r>
                     </w:p>
                   </w:txbxContent>
@@ -1432,7 +1366,6 @@
                       <wps:txbx>
                         <w:txbxContent>
                           <w:p>
-                            <w:proofErr w:type="spellStart"/>
                             <w:r>
                               <w:rPr>
                                 <w:sz w:val="18"/>
@@ -1440,7 +1373,6 @@
                               </w:rPr>
                               <w:t>T_Bode</w:t>
                             </w:r>
-                            <w:proofErr w:type="spellEnd"/>
                           </w:p>
                         </w:txbxContent>
                       </wps:txbx>
@@ -1462,7 +1394,6 @@
                 <v:textbox>
                   <w:txbxContent>
                     <w:p>
-                      <w:proofErr w:type="spellStart"/>
                       <w:r>
                         <w:rPr>
                           <w:sz w:val="18"/>
@@ -1470,7 +1401,6 @@
                         </w:rPr>
                         <w:t>T_Bode</w:t>
                       </w:r>
-                      <w:proofErr w:type="spellEnd"/>
                     </w:p>
                   </w:txbxContent>
                 </v:textbox>
@@ -1796,21 +1726,12 @@
                                 <w:szCs w:val="16"/>
                               </w:rPr>
                             </w:pPr>
-                            <w:proofErr w:type="spellStart"/>
                             <w:r>
                               <w:rPr>
                                 <w:sz w:val="16"/>
                                 <w:szCs w:val="16"/>
                               </w:rPr>
-                              <w:t>z.B</w:t>
-                            </w:r>
-                            <w:proofErr w:type="spellEnd"/>
-                            <w:r>
-                              <w:rPr>
-                                <w:sz w:val="16"/>
-                                <w:szCs w:val="16"/>
-                              </w:rPr>
-                              <w:t xml:space="preserve"> PH,</w:t>
+                              <w:t>z.B PH,</w:t>
                             </w:r>
                             <w:r>
                               <w:rPr>
@@ -1862,21 +1783,12 @@
                           <w:szCs w:val="16"/>
                         </w:rPr>
                       </w:pPr>
-                      <w:proofErr w:type="spellStart"/>
                       <w:r>
                         <w:rPr>
                           <w:sz w:val="16"/>
                           <w:szCs w:val="16"/>
                         </w:rPr>
-                        <w:t>z.B</w:t>
-                      </w:r>
-                      <w:proofErr w:type="spellEnd"/>
-                      <w:r>
-                        <w:rPr>
-                          <w:sz w:val="16"/>
-                          <w:szCs w:val="16"/>
-                        </w:rPr>
-                        <w:t xml:space="preserve"> PH,</w:t>
+                        <w:t>z.B PH,</w:t>
                       </w:r>
                       <w:r>
                         <w:rPr>
@@ -2273,7 +2185,6 @@
                       <wps:txbx>
                         <w:txbxContent>
                           <w:p>
-                            <w:proofErr w:type="spellStart"/>
                             <w:r>
                               <w:rPr>
                                 <w:sz w:val="18"/>
@@ -2291,7 +2202,6 @@
                             <w:r>
                               <w:t>u</w:t>
                             </w:r>
-                            <w:proofErr w:type="spellEnd"/>
                           </w:p>
                         </w:txbxContent>
                       </wps:txbx>
@@ -2313,7 +2223,6 @@
                 <v:textbox>
                   <w:txbxContent>
                     <w:p>
-                      <w:proofErr w:type="spellStart"/>
                       <w:r>
                         <w:rPr>
                           <w:sz w:val="18"/>
@@ -2331,7 +2240,6 @@
                       <w:r>
                         <w:t>u</w:t>
                       </w:r>
-                      <w:proofErr w:type="spellEnd"/>
                     </w:p>
                   </w:txbxContent>
                 </v:textbox>
@@ -2415,17 +2323,8 @@
                                 <w:sz w:val="16"/>
                                 <w:szCs w:val="16"/>
                               </w:rPr>
-                              <w:t xml:space="preserve"> </w:t>
+                              <w:t xml:space="preserve"> Mischverhälnis</w:t>
                             </w:r>
-                            <w:proofErr w:type="spellStart"/>
-                            <w:r>
-                              <w:rPr>
-                                <w:sz w:val="16"/>
-                                <w:szCs w:val="16"/>
-                              </w:rPr>
-                              <w:t>Mischverhälnis</w:t>
-                            </w:r>
-                            <w:proofErr w:type="spellEnd"/>
                             <w:r>
                               <w:rPr>
                                 <w:sz w:val="16"/>
@@ -2447,39 +2346,14 @@
                                 <w:szCs w:val="16"/>
                               </w:rPr>
                               <w:br/>
-                              <w:t xml:space="preserve">- </w:t>
+                              <w:t>- Alarmkofiguration</w:t>
                             </w:r>
-                            <w:proofErr w:type="spellStart"/>
                             <w:r>
                               <w:rPr>
                                 <w:sz w:val="16"/>
                                 <w:szCs w:val="16"/>
                               </w:rPr>
-                              <w:t>Alarmkofiguration</w:t>
-                            </w:r>
-                            <w:proofErr w:type="spellEnd"/>
-                            <w:r>
-                              <w:rPr>
-                                <w:sz w:val="16"/>
-                                <w:szCs w:val="16"/>
-                              </w:rPr>
-                              <w:t xml:space="preserve"> (</w:t>
-                            </w:r>
-                            <w:proofErr w:type="spellStart"/>
-                            <w:r>
-                              <w:rPr>
-                                <w:sz w:val="16"/>
-                                <w:szCs w:val="16"/>
-                              </w:rPr>
-                              <w:t>z.B</w:t>
-                            </w:r>
-                            <w:proofErr w:type="spellEnd"/>
-                            <w:r>
-                              <w:rPr>
-                                <w:sz w:val="16"/>
-                                <w:szCs w:val="16"/>
-                              </w:rPr>
-                              <w:t xml:space="preserve"> PH &gt; 8)</w:t>
+                              <w:t xml:space="preserve"> (z.B PH &gt; 8)</w:t>
                             </w:r>
                             <w:r>
                               <w:rPr>
@@ -2548,17 +2422,8 @@
                           <w:sz w:val="16"/>
                           <w:szCs w:val="16"/>
                         </w:rPr>
-                        <w:t xml:space="preserve"> </w:t>
+                        <w:t xml:space="preserve"> Mischverhälnis</w:t>
                       </w:r>
-                      <w:proofErr w:type="spellStart"/>
-                      <w:r>
-                        <w:rPr>
-                          <w:sz w:val="16"/>
-                          <w:szCs w:val="16"/>
-                        </w:rPr>
-                        <w:t>Mischverhälnis</w:t>
-                      </w:r>
-                      <w:proofErr w:type="spellEnd"/>
                       <w:r>
                         <w:rPr>
                           <w:sz w:val="16"/>
@@ -2580,39 +2445,14 @@
                           <w:szCs w:val="16"/>
                         </w:rPr>
                         <w:br/>
-                        <w:t xml:space="preserve">- </w:t>
+                        <w:t>- Alarmkofiguration</w:t>
                       </w:r>
-                      <w:proofErr w:type="spellStart"/>
                       <w:r>
                         <w:rPr>
                           <w:sz w:val="16"/>
                           <w:szCs w:val="16"/>
                         </w:rPr>
-                        <w:t>Alarmkofiguration</w:t>
-                      </w:r>
-                      <w:proofErr w:type="spellEnd"/>
-                      <w:r>
-                        <w:rPr>
-                          <w:sz w:val="16"/>
-                          <w:szCs w:val="16"/>
-                        </w:rPr>
-                        <w:t xml:space="preserve"> (</w:t>
-                      </w:r>
-                      <w:proofErr w:type="spellStart"/>
-                      <w:r>
-                        <w:rPr>
-                          <w:sz w:val="16"/>
-                          <w:szCs w:val="16"/>
-                        </w:rPr>
-                        <w:t>z.B</w:t>
-                      </w:r>
-                      <w:proofErr w:type="spellEnd"/>
-                      <w:r>
-                        <w:rPr>
-                          <w:sz w:val="16"/>
-                          <w:szCs w:val="16"/>
-                        </w:rPr>
-                        <w:t xml:space="preserve"> PH &gt; 8)</w:t>
+                        <w:t xml:space="preserve"> (z.B PH &gt; 8)</w:t>
                       </w:r>
                       <w:r>
                         <w:rPr>
@@ -3393,6 +3233,7 @@
         </w:tabs>
       </w:pPr>
       <w:r>
+        <w:lastRenderedPageBreak/>
         <w:t>Setup:</w:t>
       </w:r>
     </w:p>
@@ -3442,6 +3283,21 @@
       </w:r>
       <w:r>
         <w:t>k</w:t>
+      </w:r>
+    </w:p>
+    <w:p>
+      <w:pPr>
+        <w:pStyle w:val="Listenabsatz"/>
+        <w:numPr>
+          <w:ilvl w:val="0"/>
+          <w:numId w:val="1"/>
+        </w:numPr>
+        <w:tabs>
+          <w:tab w:val="left" w:pos="7241"/>
+        </w:tabs>
+      </w:pPr>
+      <w:r>
+        <w:t>Kabelzugriff</w:t>
       </w:r>
     </w:p>
     <w:sectPr>

</xml_diff>